<commit_message>
feat: PO form layout overhaul, clean canonical letterheads, and v1.1.2 version display in navbar & sidebar
</commit_message>
<xml_diff>
--- a/datasets-needed/LETTER HEAD-SRI-India.docx
+++ b/datasets-needed/LETTER HEAD-SRI-India.docx
@@ -1,71 +1,23 @@
 
 <file path=word/document.xml><?xml version="1.0" encoding="utf-8"?>
-<w:document xmlns:wpc="http://schemas.microsoft.com/office/word/2010/wordprocessingCanvas" xmlns:cx="http://schemas.microsoft.com/office/drawing/2014/chartex" xmlns:cx1="http://schemas.microsoft.com/office/drawing/2015/9/8/chartex" xmlns:cx2="http://schemas.microsoft.com/office/drawing/2015/10/21/chartex" xmlns:cx3="http://schemas.microsoft.com/office/drawing/2016/5/9/chartex" xmlns:cx4="http://schemas.microsoft.com/office/drawing/2016/5/10/chartex" xmlns:cx5="http://schemas.microsoft.com/office/drawing/2016/5/11/chartex" xmlns:cx6="http://schemas.microsoft.com/office/drawing/2016/5/12/chartex" xmlns:cx7="http://schemas.microsoft.com/office/drawing/2016/5/13/chartex" xmlns:cx8="http://schemas.microsoft.com/office/drawing/2016/5/14/chartex" xmlns:mc="http://schemas.openxmlformats.org/markup-compatibility/2006" xmlns:aink="http://schemas.microsoft.com/office/drawing/2016/ink" xmlns:am3d="http://schemas.microsoft.com/office/drawing/2017/model3d" xmlns:o="urn:schemas-microsoft-com:office:office" xmlns:oel="http://schemas.microsoft.com/office/2019/extlst" xmlns:r="http://schemas.openxmlformats.org/officeDocument/2006/relationships" xmlns:m="http://schemas.openxmlformats.org/officeDocument/2006/math" xmlns:v="urn:schemas-microsoft-com:vml" xmlns:wp14="http://schemas.microsoft.com/office/word/2010/wordprocessingDrawing" xmlns:wp="http://schemas.openxmlformats.org/drawingml/2006/wordprocessingDrawing" xmlns:w10="urn:schemas-microsoft-com:office:word" xmlns:w="http://schemas.openxmlformats.org/wordprocessingml/2006/main" xmlns:w14="http://schemas.microsoft.com/office/word/2010/wordml" xmlns:w15="http://schemas.microsoft.com/office/word/2012/wordml" xmlns:w16cex="http://schemas.microsoft.com/office/word/2018/wordml/cex" xmlns:w16cid="http://schemas.microsoft.com/office/word/2016/wordml/cid" xmlns:w16="http://schemas.microsoft.com/office/word/2018/wordml" xmlns:w16du="http://schemas.microsoft.com/office/word/2023/wordml/word16du" xmlns:w16sdtdh="http://schemas.microsoft.com/office/word/2020/wordml/sdtdatahash" xmlns:w16sdtfl="http://schemas.microsoft.com/office/word/2024/wordml/sdtformatlock" xmlns:w16se="http://schemas.microsoft.com/office/word/2015/wordml/symex" xmlns:wpg="http://schemas.microsoft.com/office/word/2010/wordprocessingGroup" xmlns:wpi="http://schemas.microsoft.com/office/word/2010/wordprocessingInk" xmlns:wne="http://schemas.microsoft.com/office/word/2006/wordml" xmlns:wps="http://schemas.microsoft.com/office/word/2010/wordprocessingShape" mc:Ignorable="w14 w15 w16se w16cid w16 w16cex w16sdtdh w16sdtfl w16du wp14">
-  <w:body>
-    <w:p>
-      <w:pPr>
-        <w:ind w:left="-540"/>
-      </w:pPr>
-      <w:r>
-        <w:t>Date: 28/11/2025</w:t>
-      </w:r>
-      <w:r>
-        <w:tab/>
-      </w:r>
-      <w:r>
-        <w:tab/>
-      </w:r>
-      <w:r>
-        <w:tab/>
-      </w:r>
-      <w:r>
-        <w:tab/>
-      </w:r>
-      <w:r>
-        <w:tab/>
-      </w:r>
-      <w:r>
-        <w:tab/>
-      </w:r>
-      <w:r>
-        <w:tab/>
-      </w:r>
-      <w:r>
-        <w:tab/>
-      </w:r>
-      <w:r>
-        <w:tab/>
-        <w:t xml:space="preserve">Ref </w:t>
-      </w:r>
-      <w:proofErr w:type="gramStart"/>
-      <w:r>
-        <w:t>No.:SRI</w:t>
-      </w:r>
-      <w:proofErr w:type="gramEnd"/>
-      <w:r>
-        <w:t>/01/25</w:t>
-      </w:r>
-    </w:p>
-    <w:p>
-      <w:r>
-        <w:t xml:space="preserve"> </w:t>
-      </w:r>
-    </w:p>
-    <w:sectPr>
-      <w:headerReference w:type="even" r:id="rId9"/>
-      <w:headerReference w:type="default" r:id="rId10"/>
-      <w:footerReference w:type="even" r:id="rId11"/>
-      <w:footerReference w:type="default" r:id="rId12"/>
-      <w:headerReference w:type="first" r:id="rId13"/>
-      <w:footerReference w:type="first" r:id="rId14"/>
-      <w:type w:val="continuous"/>
-      <w:pgSz w:w="11907" w:h="16839" w:code="9"/>
-      <w:pgMar w:top="720" w:right="720" w:bottom="720" w:left="1080" w:header="0" w:footer="0" w:gutter="0"/>
-      <w:cols w:space="720"/>
-      <w:docGrid w:linePitch="360"/>
-    </w:sectPr>
-  </w:body>
-</w:document>
+<ns0:document xmlns:ns0="http://schemas.openxmlformats.org/wordprocessingml/2006/main" xmlns:ns1="http://schemas.openxmlformats.org/markup-compatibility/2006" xmlns:ns2="http://schemas.openxmlformats.org/officeDocument/2006/relationships" ns1:Ignorable="w14 w15 w16se w16cid w16 w16cex w16sdtdh w16sdtfl w16du wp14">
+  <ns0:body>
+    <ns0:p/>
+    <ns0:sectPr ns0:rsidR="002F713C" ns0:rsidRPr="00497C14" ns0:rsidSect="008B443D">
+      <ns0:headerReference ns0:type="even" ns2:id="rId9"/>
+      <ns0:headerReference ns0:type="default" ns2:id="rId10"/>
+      <ns0:footerReference ns0:type="even" ns2:id="rId11"/>
+      <ns0:footerReference ns0:type="default" ns2:id="rId12"/>
+      <ns0:headerReference ns0:type="first" ns2:id="rId13"/>
+      <ns0:footerReference ns0:type="first" ns2:id="rId14"/>
+      <ns0:type ns0:val="continuous"/>
+      <ns0:pgSz ns0:w="11907" ns0:h="16839" ns0:code="9"/>
+      <ns0:pgMar ns0:top="720" ns0:right="720" ns0:bottom="720" ns0:left="1080" ns0:header="0" ns0:footer="0" ns0:gutter="0"/>
+      <ns0:cols ns0:space="720"/>
+      <ns0:docGrid ns0:linePitch="360"/>
+    </ns0:sectPr>
+  </ns0:body>
+</ns0:document>
 </file>
 
 <file path=word/endnotes.xml><?xml version="1.0" encoding="utf-8"?>
@@ -426,7 +378,7 @@
               <wp:positionV relativeFrom="paragraph">
                 <wp:posOffset>115974</wp:posOffset>
               </wp:positionV>
-              <wp:extent cx="4724400" cy="1292225"/>
+              <wp:extent cx="4724400" cy="1550000"/>
               <wp:effectExtent l="0" t="0" r="0" b="3175"/>
               <wp:wrapSquare wrapText="bothSides"/>
               <wp:docPr id="217" name="Text Box 2"/>
@@ -442,7 +394,7 @@
                     <wps:spPr bwMode="auto">
                       <a:xfrm>
                         <a:off x="0" y="0"/>
-                        <a:ext cx="4724400" cy="1292225"/>
+                        <a:ext cx="4724400" cy="1550000"/>
                       </a:xfrm>
                       <a:prstGeom prst="rect">
                         <a:avLst/>
@@ -618,7 +570,7 @@
               <v:stroke joinstyle="miter"/>
               <v:path gradientshapeok="t" o:connecttype="rect"/>
             </v:shapetype>
-            <v:shape id="Text Box 2" o:spid="_x0000_s1026" type="#_x0000_t202" style="position:absolute;margin-left:-31.5pt;margin-top:9.15pt;width:372pt;height:101.75pt;z-index:251657215;visibility:visible;mso-wrap-style:square;mso-width-percent:0;mso-height-percent:0;mso-wrap-distance-left:9pt;mso-wrap-distance-top:3.6pt;mso-wrap-distance-right:9pt;mso-wrap-distance-bottom:3.6pt;mso-position-horizontal:absolute;mso-position-horizontal-relative:text;mso-position-vertical:absolute;mso-position-vertical-relative:text;mso-width-percent:0;mso-height-percent:0;mso-width-relative:margin;mso-height-relative:margin;v-text-anchor:top" o:gfxdata="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" filled="f" stroked="f">
+            <v:shape id="Text Box 2" o:spid="_x0000_s1026" type="#_x0000_t202" style="position:absolute;margin-left:-31.5pt;margin-top:9.15pt;width:372pt;height:122pt;z-index:251657215;visibility:visible;mso-wrap-style:square;mso-width-percent:0;mso-height-percent:0;mso-wrap-distance-left:9pt;mso-wrap-distance-top:3.6pt;mso-wrap-distance-right:9pt;mso-wrap-distance-bottom:3.6pt;mso-position-horizontal:absolute;mso-position-horizontal-relative:text;mso-position-vertical:absolute;mso-position-vertical-relative:text;mso-width-percent:0;mso-height-percent:0;mso-width-relative:margin;mso-height-relative:margin;v-text-anchor:top" o:gfxdata="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" filled="f" stroked="f">
               <v:textbox>
                 <w:txbxContent>
                   <w:p>

</xml_diff>